<commit_message>
Rewire notary blocks; intake reporting + UI updates
</commit_message>
<xml_diff>
--- a/templates/canonical/packet_split/final_disposition_client1.docx
+++ b/templates/canonical/packet_split/final_disposition_client1.docx
@@ -267,7 +267,7 @@
       </w:pPr>
       <w:r>
         <w:tab/>
-        <w:t>[[CLIENT2FULLNAME]]</w:t>
+        <w:t>[[Client1FinalDispositionPrimaryFullName]]</w:t>
       </w:r>
     </w:p>
     <w:p>
@@ -286,7 +286,7 @@
         <w:rPr>
           <w:color w:val="000000"/>
         </w:rPr>
-        <w:t>ClientStreetAddress</w:t>
+        <w:t>Client1FinalDispositionPrimaryStreetAddress</w:t>
       </w:r>
       <w:proofErr w:type="spellEnd"/>
       <w:r>
@@ -309,7 +309,7 @@
         <w:rPr>
           <w:color w:val="000000"/>
         </w:rPr>
-        <w:t>ClientCity</w:t>
+        <w:t>Client1FinalDispositionPrimaryCity</w:t>
       </w:r>
       <w:proofErr w:type="spellEnd"/>
       <w:r>
@@ -319,7 +319,7 @@
         <w:t>]],</w:t>
       </w:r>
       <w:r>
-        <w:t xml:space="preserve"> Virginia [[Zip]]</w:t>
+        <w:t xml:space="preserve"> [[Client1FinalDispositionPrimaryState]] [[Client1FinalDispositionPrimaryZip]]</w:t>
       </w:r>
     </w:p>
     <w:p>
@@ -333,7 +333,7 @@
         <w:rPr>
           <w:color w:val="000000"/>
         </w:rPr>
-        <w:t xml:space="preserve">222-222-2222 </w:t>
+        <w:t xml:space="preserve">[[Client1FinalDispositionPrimaryPhone]] </w:t>
       </w:r>
     </w:p>
     <w:p>
@@ -379,7 +379,7 @@
       </w:pPr>
       <w:r>
         <w:tab/>
-        <w:t>[[CLIENT1FIRSTALTERNATEAMDFULLNAME]]</w:t>
+        <w:t>[[Client1FinalDispositionAlternatesText]]</w:t>
       </w:r>
     </w:p>
     <w:p>
@@ -401,7 +401,7 @@
           <w:color w:val="000000"/>
         </w:rPr>
         <w:tab/>
-        <w:t>[[Client1FirstAlternateAMDEmail]], [[Client1FirstAlternateAMDAddress]]</w:t>
+        <w:t>, </w:t>
       </w:r>
     </w:p>
     <w:p>
@@ -441,7 +441,7 @@
       </w:pPr>
       <w:r>
         <w:tab/>
-        <w:t>[[CLIENT1SECONDALTERNATEAMDFULLNAME]]</w:t>
+        <w:t/>
       </w:r>
     </w:p>
     <w:p>
@@ -463,7 +463,7 @@
           <w:color w:val="000000"/>
         </w:rPr>
         <w:tab/>
-        <w:t>[[Client1SecondAlternatePOAEmail]], [[Client1SecondAlternateAMDAddress]]</w:t>
+        <w:t>, </w:t>
       </w:r>
     </w:p>
     <w:p>
@@ -635,20 +635,20 @@
         <w:rPr>
           <w:color w:val="000000"/>
         </w:rPr>
-        <w:t xml:space="preserve">I attest that </w:t>
+        <w:t xml:space="preserve">County/City of [[County/City]], Commonwealth of Virginia. The foregoing instrument was acknowledged before me this _____ day of ___________________, 2022, by </w:t>
       </w:r>
       <w:r>
         <w:rPr>
           <w:color w:val="000000"/>
           <w:spacing w:val="2"/>
         </w:rPr>
-        <w:t xml:space="preserve">[[CLIENT1FULLNAME]], the person who signed this document, did so </w:t>
+        <w:t xml:space="preserve">[[CLIENT1FULLNAME]]</w:t>
       </w:r>
       <w:r>
         <w:rPr>
           <w:color w:val="000000"/>
         </w:rPr>
-        <w:t>or acknowledged signing this document in my presence and that he</w:t>
+        <w:t/>
       </w:r>
       <w:r>
         <w:rPr>
@@ -661,16 +661,16 @@
         <w:rPr>
           <w:color w:val="000000"/>
         </w:rPr>
-        <w:t xml:space="preserve">appears to be of sound mind and not subject to duress, fraud, or undue influence. I further attest that I am not the representative or the successor representative appointed under this document, that I am at least eighteen (18) years of age, and that I am not related to the </w:t>
+        <w:t xml:space="preserve"/>
       </w:r>
       <w:r>
-        <w:t xml:space="preserve">person who signed this document </w:t>
+        <w:t xml:space="preserve"/>
       </w:r>
       <w:r>
         <w:rPr>
           <w:color w:val="000000"/>
         </w:rPr>
-        <w:t>by blood, marriage, or adoption.</w:t>
+        <w:t/>
       </w:r>
     </w:p>
     <w:p>
@@ -704,7 +704,7 @@
       </w:r>
       <w:r>
         <w:tab/>
-        <w:t>2000 Duke St. Ste 300</w:t>
+        <w:t>MICHAEL DOUD GILL III, Notary Public</w:t>
       </w:r>
     </w:p>
     <w:p>
@@ -723,11 +723,11 @@
         <w:rPr>
           <w:sz w:val="20"/>
         </w:rPr>
-        <w:t>[signature – please print name under this line]</w:t>
+        <w:t/>
       </w:r>
       <w:r>
         <w:tab/>
-        <w:t>Alexandria, Virginia</w:t>
+        <w:t>My commission expires: _________________</w:t>
       </w:r>
     </w:p>
     <w:p>
@@ -770,7 +770,7 @@
       </w:r>
       <w:r>
         <w:tab/>
-        <w:t>2000 Duke St. Ste 300</w:t>
+        <w:t/>
       </w:r>
     </w:p>
     <w:p>
@@ -787,11 +787,11 @@
         <w:rPr>
           <w:sz w:val="20"/>
         </w:rPr>
-        <w:t>[signature – please print name under this line]</w:t>
+        <w:t/>
       </w:r>
       <w:r>
         <w:tab/>
-        <w:t>Alexandria, Virginia</w:t>
+        <w:t/>
       </w:r>
     </w:p>
     <w:p>

</xml_diff>